<commit_message>
feat(om): auto-suggest route data and improve UX
Add useRouteSuggestion hook to auto-fill etapa fields based on previous
missions. Add visual indicators for route lookup status. Improve OM
export with structured crew groups. Fix etiquetas API route. Format
n_doc with zero padding. Reorder nav menu items. Improve TypeScript
null safety in configPage.

Co-Authored-By: Claude Opus 4.5 <noreply@anthropic.com>
</commit_message>
<xml_diff>
--- a/public/templates/om.docx
+++ b/public/templates/om.docx
@@ -492,6 +492,16 @@
                 <w:szCs w:val="20"/>
                 <w:lang w:val="pt-BR" w:eastAsia="en-US" w:bidi="ar-SA"/>
               </w:rPr>
+              <w:t xml:space="preserve">KC-390 </w:t>
+            </w:r>
+            <w:r>
+              <w:rPr>
+                <w:rFonts w:eastAsia="Calibri" w:cs="Calibri" w:cstheme="minorHAnsi"/>
+                <w:kern w:val="0"/>
+                <w:sz w:val="20"/>
+                <w:szCs w:val="20"/>
+                <w:lang w:val="pt-BR" w:eastAsia="en-US" w:bidi="ar-SA"/>
+              </w:rPr>
               <w:t>{aeronave}</w:t>
             </w:r>
           </w:p>
@@ -519,21 +529,66 @@
               <w:spacing w:lineRule="auto" w:line="240" w:before="0" w:after="0"/>
               <w:jc w:val="left"/>
               <w:rPr>
+                <w:b/>
+                <w:bCs/>
+                <w:sz w:val="22"/>
+              </w:rPr>
+            </w:pPr>
+            <w:r>
+              <w:rPr>
+                <w:rFonts w:eastAsia="Calibri" w:cs=""/>
+                <w:b/>
+                <w:bCs/>
+                <w:kern w:val="0"/>
+                <w:sz w:val="22"/>
+                <w:szCs w:val="22"/>
+                <w:lang w:val="pt-BR" w:eastAsia="en-US" w:bidi="ar-SA"/>
+              </w:rPr>
+              <w:t>{#grupos} {grupo}</w:t>
+            </w:r>
+          </w:p>
+        </w:tc>
+      </w:tr>
+      <w:tr>
+        <w:trPr>
+          <w:trHeight w:val="182" w:hRule="atLeast"/>
+        </w:trPr>
+        <w:tc>
+          <w:tcPr>
+            <w:tcW w:w="11023" w:type="dxa"/>
+            <w:gridSpan w:val="2"/>
+            <w:tcBorders>
+              <w:top w:val="nil"/>
+            </w:tcBorders>
+          </w:tcPr>
+          <w:p>
+            <w:pPr>
+              <w:pStyle w:val="Normal"/>
+              <w:widowControl/>
+              <w:tabs>
+                <w:tab w:val="clear" w:pos="708"/>
+                <w:tab w:val="left" w:pos="8931" w:leader="none"/>
+              </w:tabs>
+              <w:suppressAutoHyphens w:val="true"/>
+              <w:spacing w:lineRule="auto" w:line="240" w:before="0" w:after="0"/>
+              <w:jc w:val="left"/>
+              <w:rPr>
                 <w:rFonts w:cs="Calibri" w:cstheme="minorHAnsi"/>
-                <w:b/>
+                <w:b w:val="false"/>
+                <w:bCs w:val="false"/>
                 <w:sz w:val="20"/>
                 <w:szCs w:val="20"/>
               </w:rPr>
             </w:pPr>
             <w:r>
               <w:rPr>
-                <w:rFonts w:eastAsia="Calibri" w:cs=""/>
-                <w:kern w:val="0"/>
-                <w:sz w:val="22"/>
-                <w:szCs w:val="22"/>
-                <w:lang w:val="pt-BR" w:eastAsia="en-US" w:bidi="ar-SA"/>
-              </w:rPr>
-              <w:t>{tripulacao}</w:t>
+                <w:rFonts w:cs="Calibri" w:cstheme="minorHAnsi"/>
+                <w:b w:val="false"/>
+                <w:bCs w:val="false"/>
+                <w:sz w:val="20"/>
+                <w:szCs w:val="20"/>
+              </w:rPr>
+              <w:t>{crew_member} {/grupos}</w:t>
             </w:r>
           </w:p>
         </w:tc>
@@ -1367,11 +1422,7 @@
         <w:pStyle w:val="NoSpacing"/>
         <w:jc w:val="center"/>
         <w:rPr>
-          <w:rFonts w:cs="Calibri" w:cstheme="minorHAnsi"/>
-          <w:b/>
-          <w:sz w:val="20"/>
-          <w:szCs w:val="20"/>
-          <w:u w:val="single"/>
+          <w:u w:val="none"/>
         </w:rPr>
       </w:pPr>
       <w:r>
@@ -1380,7 +1431,7 @@
           <w:b/>
           <w:sz w:val="20"/>
           <w:szCs w:val="20"/>
-          <w:u w:val="single"/>
+          <w:u w:val="none"/>
         </w:rPr>
         <w:t>ORDENS ESPECIAIS</w:t>
       </w:r>
@@ -2809,8 +2860,8 @@
       <w:u w:val="single"/>
     </w:rPr>
   </w:style>
-  <w:style w:type="character" w:styleId="Cdigo-fonteuser">
-    <w:name w:val="Código-fonte (user)"/>
+  <w:style w:type="character" w:styleId="Cdigo-fonte">
+    <w:name w:val="Código-fonte"/>
     <w:qFormat/>
     <w:rPr>
       <w:rFonts w:ascii="Liberation Mono" w:hAnsi="Liberation Mono" w:eastAsia="Liberation Mono" w:cs="Liberation Mono"/>
@@ -2900,15 +2951,15 @@
       <w:rFonts w:cs="Noto Sans Devanagari"/>
     </w:rPr>
   </w:style>
-  <w:style w:type="paragraph" w:styleId="Cabealhoerodapuser">
-    <w:name w:val="Cabeçalho e rodapé (user)"/>
+  <w:style w:type="paragraph" w:styleId="Cabealhoerodap">
+    <w:name w:val="Cabeçalho e rodapé"/>
     <w:basedOn w:val="Normal"/>
     <w:qFormat/>
     <w:pPr/>
     <w:rPr/>
   </w:style>
-  <w:style w:type="paragraph" w:styleId="Cabealhoerodap">
-    <w:name w:val="Cabeçalho e rodapé"/>
+  <w:style w:type="paragraph" w:styleId="Cabealhoerodapuser">
+    <w:name w:val="Cabeçalho e rodapé (user)"/>
     <w:basedOn w:val="Normal"/>
     <w:qFormat/>
     <w:pPr/>
@@ -3020,8 +3071,8 @@
       <w:lang w:val="pt-BR" w:eastAsia="en-US" w:bidi="ar-SA"/>
     </w:rPr>
   </w:style>
-  <w:style w:type="paragraph" w:styleId="Contedodatabelauser">
-    <w:name w:val="Conteúdo da tabela (user)"/>
+  <w:style w:type="paragraph" w:styleId="Contedodatabela">
+    <w:name w:val="Conteúdo da tabela"/>
     <w:basedOn w:val="Normal"/>
     <w:qFormat/>
     <w:pPr>
@@ -3030,9 +3081,9 @@
     </w:pPr>
     <w:rPr/>
   </w:style>
-  <w:style w:type="paragraph" w:styleId="Ttulodetabelauser">
-    <w:name w:val="Título de tabela (user)"/>
-    <w:basedOn w:val="Contedodatabelauser"/>
+  <w:style w:type="paragraph" w:styleId="Ttulodetabela">
+    <w:name w:val="Título de tabela"/>
+    <w:basedOn w:val="Contedodatabela"/>
     <w:qFormat/>
     <w:pPr>
       <w:suppressLineNumbers/>
@@ -3043,8 +3094,8 @@
       <w:bCs/>
     </w:rPr>
   </w:style>
-  <w:style w:type="paragraph" w:styleId="Textoprformatadouser">
-    <w:name w:val="Texto préformatado (user)"/>
+  <w:style w:type="paragraph" w:styleId="Textoprformatado">
+    <w:name w:val="Texto préformatado"/>
     <w:basedOn w:val="Normal"/>
     <w:qFormat/>
     <w:pPr>
@@ -3056,8 +3107,8 @@
       <w:szCs w:val="20"/>
     </w:rPr>
   </w:style>
-  <w:style w:type="numbering" w:styleId="Semlistauser" w:default="1">
-    <w:name w:val="Sem lista (user)"/>
+  <w:style w:type="numbering" w:styleId="Semlista" w:default="1">
+    <w:name w:val="Sem lista"/>
     <w:uiPriority w:val="99"/>
     <w:semiHidden/>
     <w:unhideWhenUsed/>

</xml_diff>

<commit_message>
refactor(docx): simplify docxtemplater render calls
Use doc.render(data) directly instead of separate setData() and render()
calls. Update om.docx template.

Co-Authored-By: Claude Opus 4.5 <noreply@anthropic.com>
</commit_message>
<xml_diff>
--- a/public/templates/om.docx
+++ b/public/templates/om.docx
@@ -1043,7 +1043,40 @@
                 <w:szCs w:val="18"/>
                 <w:lang w:val="pt-BR" w:eastAsia="en-US" w:bidi="ar-SA"/>
               </w:rPr>
-              <w:t>ESF. AER</w:t>
+              <w:t>ESF</w:t>
+            </w:r>
+            <w:r>
+              <w:rPr>
+                <w:rFonts w:eastAsia="Calibri" w:cs="Calibri" w:cstheme="minorHAnsi"/>
+                <w:b/>
+                <w:kern w:val="0"/>
+                <w:sz w:val="18"/>
+                <w:szCs w:val="18"/>
+                <w:lang w:val="pt-BR" w:eastAsia="en-US" w:bidi="ar-SA"/>
+              </w:rPr>
+              <w:t>ORÇO</w:t>
+            </w:r>
+            <w:r>
+              <w:rPr>
+                <w:rFonts w:eastAsia="Calibri" w:cs="Calibri" w:cstheme="minorHAnsi"/>
+                <w:b/>
+                <w:kern w:val="0"/>
+                <w:sz w:val="18"/>
+                <w:szCs w:val="18"/>
+                <w:lang w:val="pt-BR" w:eastAsia="en-US" w:bidi="ar-SA"/>
+              </w:rPr>
+              <w:t>. AÉR</w:t>
+            </w:r>
+            <w:r>
+              <w:rPr>
+                <w:rFonts w:eastAsia="Calibri" w:cs="Calibri" w:cstheme="minorHAnsi"/>
+                <w:b/>
+                <w:kern w:val="0"/>
+                <w:sz w:val="18"/>
+                <w:szCs w:val="18"/>
+                <w:lang w:val="pt-BR" w:eastAsia="en-US" w:bidi="ar-SA"/>
+              </w:rPr>
+              <w:t>EO</w:t>
             </w:r>
           </w:p>
         </w:tc>

</xml_diff>